<commit_message>
Modificación del proyecto Final
</commit_message>
<xml_diff>
--- a/Proyecto.docx
+++ b/Proyecto.docx
@@ -4146,11 +4146,6 @@
           <w:ilvl w:val="0"/>
           <w:numId w:val="2"/>
         </w:numPr>
-        <w:rPr>
-          <w:rStyle w:val="Hipervnculo"/>
-          <w:color w:val="auto"/>
-          <w:u w:val="none"/>
-        </w:rPr>
       </w:pPr>
       <w:r>
         <w:rPr>
@@ -4158,7 +4153,7 @@
           <w:sz w:val="22"/>
           <w:szCs w:val="22"/>
         </w:rPr>
-        <w:t xml:space="preserve">Beta del proyecto: </w:t>
+        <w:t xml:space="preserve">Proyecto Final video: </w:t>
       </w:r>
       <w:hyperlink r:id="rId16" w:history="1">
         <w:r>
@@ -4168,7 +4163,7 @@
             <w:sz w:val="22"/>
             <w:szCs w:val="22"/>
           </w:rPr>
-          <w:t>https://www.youtube.com/watch?v=MbXjQ9SPg84</w:t>
+          <w:t>https://youtu.be/z9in3R40fl0</w:t>
         </w:r>
       </w:hyperlink>
     </w:p>
@@ -4181,10 +4176,7 @@
         </w:numPr>
       </w:pPr>
       <w:r>
-        <w:t>Git Hub del proyecto</w:t>
-      </w:r>
-      <w:r>
-        <w:t>:</w:t>
+        <w:t>Git Hub del proyecto:</w:t>
       </w:r>
       <w:r>
         <w:t xml:space="preserve"> </w:t>
@@ -4200,11 +4192,7 @@
     </w:p>
     <w:p>
       <w:pPr>
-        <w:pStyle w:val="Prrafodelista"/>
-        <w:numPr>
-          <w:ilvl w:val="0"/>
-          <w:numId w:val="2"/>
-        </w:numPr>
+        <w:ind w:left="462"/>
       </w:pPr>
     </w:p>
     <w:p>

</xml_diff>